<commit_message>
alendar zero-obs bug, two   skip-first edge cases, CPI CAGR off-by-one
</commit_message>
<xml_diff>
--- a/results/report.docx
+++ b/results/report.docx
@@ -51,7 +51,7 @@
         <w:pStyle w:val="ListBullet"/>
       </w:pPr>
       <w:r>
-        <w:t>Calendar start-cohort windows are reported separately; for example, 62.2 % of the 2015-2025 start-cohort observations were positive in nominal terms.</w:t>
+        <w:t>Calendar start-cohort windows are reported separately; for example, 62.7 % of the 2015-2025 start-cohort observations were positive in nominal terms.</w:t>
       </w:r>
     </w:p>
     <w:p>
@@ -85,7 +85,7 @@
     </w:p>
     <w:p>
       <w:r>
-        <w:t>CPI-U inflation factor from 192501 to 202512: 18.73x (2.94 % annualized).</w:t>
+        <w:t>CPI-U inflation factor from 192501 to 202512: 18.73x (2.95 % annualized).</w:t>
       </w:r>
     </w:p>
     <w:p>
@@ -106,12 +106,12 @@
     </w:p>
     <w:p>
       <w:r>
-        <w:t>The calendar-window view forms start cohorts at fixed dates such as 1925-12, 1935-12, and so on. A stock must be present at the start of a calendar window; stocks that list midway through that window are not added halfway.</w:t>
+        <w:t>The calendar-window view forms start cohorts at fixed dates such as 1925-12, 1935-12, and so on. A stock must be present at the start of a calendar window; stocks that list midway through that window are not added halfway. The window represents a buy-at-end-of-start_ymm to sell-at-end-of-target_end_ymm investor: the start_ymm month return itself is excluded from compounding, since it was earned before the assumed entry. Cohort stocks whose only observation is the start_ymm month (delisted during the start month, hence not tradable at end of start_ymm) are excluded from headline summaries via the no-post-start-obs flag.</w:t>
       </w:r>
     </w:p>
     <w:p>
       <w:r>
-        <w:t>Detail files include CRSP terminal fields and sparse-history flags for auditability. The main return convention includes the first observed monthly return; a sensitivity table also reports results after skipping that first observed return.</w:t>
+        <w:t>Detail files include CRSP terminal fields and sparse-history flags for auditability. For stock-anchored periods the main return convention includes the first observed monthly return; a sensitivity table also reports results after skipping that first observed return.</w:t>
       </w:r>
     </w:p>
     <w:p>
@@ -2285,7 +2285,7 @@
               <w:rPr>
                 <w:sz w:val="18"/>
               </w:rPr>
-              <w:t>852</w:t>
+              <w:t>851</w:t>
             </w:r>
           </w:p>
         </w:tc>
@@ -2302,7 +2302,7 @@
               <w:rPr>
                 <w:sz w:val="18"/>
               </w:rPr>
-              <w:t>88.5 %</w:t>
+              <w:t>88.6 %</w:t>
             </w:r>
           </w:p>
         </w:tc>
@@ -2319,7 +2319,7 @@
               <w:rPr>
                 <w:sz w:val="18"/>
               </w:rPr>
-              <w:t>78.9 %</w:t>
+              <w:t>79.0 %</w:t>
             </w:r>
           </w:p>
         </w:tc>
@@ -2336,7 +2336,7 @@
               <w:rPr>
                 <w:sz w:val="18"/>
               </w:rPr>
-              <w:t>+164.9 %</w:t>
+              <w:t>+165.4 %</w:t>
             </w:r>
           </w:p>
         </w:tc>
@@ -2353,7 +2353,7 @@
               <w:rPr>
                 <w:sz w:val="18"/>
               </w:rPr>
-              <w:t>+79.9 %</w:t>
+              <w:t>+80.2 %</w:t>
             </w:r>
           </w:p>
         </w:tc>
@@ -2370,7 +2370,7 @@
               <w:rPr>
                 <w:sz w:val="18"/>
               </w:rPr>
-              <w:t>8.2 %</w:t>
+              <w:t>8.1 %</w:t>
             </w:r>
           </w:p>
         </w:tc>
@@ -2406,7 +2406,7 @@
               <w:rPr>
                 <w:sz w:val="18"/>
               </w:rPr>
-              <w:t>1,050</w:t>
+              <w:t>1,048</w:t>
             </w:r>
           </w:p>
         </w:tc>
@@ -2423,7 +2423,7 @@
               <w:rPr>
                 <w:sz w:val="18"/>
               </w:rPr>
-              <w:t>89.0 %</w:t>
+              <w:t>89.2 %</w:t>
             </w:r>
           </w:p>
         </w:tc>
@@ -2440,7 +2440,7 @@
               <w:rPr>
                 <w:sz w:val="18"/>
               </w:rPr>
-              <w:t>85.8 %</w:t>
+              <w:t>86.0 %</w:t>
             </w:r>
           </w:p>
         </w:tc>
@@ -2457,7 +2457,7 @@
               <w:rPr>
                 <w:sz w:val="18"/>
               </w:rPr>
-              <w:t>+152.9 %</w:t>
+              <w:t>+153.1 %</w:t>
             </w:r>
           </w:p>
         </w:tc>
@@ -2474,7 +2474,7 @@
               <w:rPr>
                 <w:sz w:val="18"/>
               </w:rPr>
-              <w:t>+114.1 %</w:t>
+              <w:t>+114.7 %</w:t>
             </w:r>
           </w:p>
         </w:tc>
@@ -2491,7 +2491,7 @@
               <w:rPr>
                 <w:sz w:val="18"/>
               </w:rPr>
-              <w:t>21.0 %</w:t>
+              <w:t>20.8 %</w:t>
             </w:r>
           </w:p>
         </w:tc>
@@ -2527,7 +2527,7 @@
               <w:rPr>
                 <w:sz w:val="18"/>
               </w:rPr>
-              <w:t>2,168</w:t>
+              <w:t>2,157</w:t>
             </w:r>
           </w:p>
         </w:tc>
@@ -2544,7 +2544,7 @@
               <w:rPr>
                 <w:sz w:val="18"/>
               </w:rPr>
-              <w:t>59.3 %</w:t>
+              <w:t>59.6 %</w:t>
             </w:r>
           </w:p>
         </w:tc>
@@ -2561,7 +2561,7 @@
               <w:rPr>
                 <w:sz w:val="18"/>
               </w:rPr>
-              <w:t>38.0 %</w:t>
+              <w:t>38.2 %</w:t>
             </w:r>
           </w:p>
         </w:tc>
@@ -2578,7 +2578,7 @@
               <w:rPr>
                 <w:sz w:val="18"/>
               </w:rPr>
-              <w:t>+16.8 %</w:t>
+              <w:t>+17.3 %</w:t>
             </w:r>
           </w:p>
         </w:tc>
@@ -2595,7 +2595,7 @@
               <w:rPr>
                 <w:sz w:val="18"/>
               </w:rPr>
-              <w:t>-23.5 %</w:t>
+              <w:t>-23.9 %</w:t>
             </w:r>
           </w:p>
         </w:tc>
@@ -2612,7 +2612,7 @@
               <w:rPr>
                 <w:sz w:val="18"/>
               </w:rPr>
-              <w:t>32.9 %</w:t>
+              <w:t>32.6 %</w:t>
             </w:r>
           </w:p>
         </w:tc>
@@ -2648,7 +2648,7 @@
               <w:rPr>
                 <w:sz w:val="18"/>
               </w:rPr>
-              <w:t>5,073</w:t>
+              <w:t>5,053</w:t>
             </w:r>
           </w:p>
         </w:tc>
@@ -2665,7 +2665,7 @@
               <w:rPr>
                 <w:sz w:val="18"/>
               </w:rPr>
-              <w:t>87.8 %</w:t>
+              <w:t>88.1 %</w:t>
             </w:r>
           </w:p>
         </w:tc>
@@ -2682,7 +2682,7 @@
               <w:rPr>
                 <w:sz w:val="18"/>
               </w:rPr>
-              <w:t>79.7 %</w:t>
+              <w:t>80.0 %</w:t>
             </w:r>
           </w:p>
         </w:tc>
@@ -2699,7 +2699,7 @@
               <w:rPr>
                 <w:sz w:val="18"/>
               </w:rPr>
-              <w:t>+295.5 %</w:t>
+              <w:t>+297.7 %</w:t>
             </w:r>
           </w:p>
         </w:tc>
@@ -2716,7 +2716,7 @@
               <w:rPr>
                 <w:sz w:val="18"/>
               </w:rPr>
-              <w:t>+133.3 %</w:t>
+              <w:t>+133.9 %</w:t>
             </w:r>
           </w:p>
         </w:tc>
@@ -2733,7 +2733,7 @@
               <w:rPr>
                 <w:sz w:val="18"/>
               </w:rPr>
-              <w:t>43.9 %</w:t>
+              <w:t>43.7 %</w:t>
             </w:r>
           </w:p>
         </w:tc>
@@ -2769,7 +2769,7 @@
               <w:rPr>
                 <w:sz w:val="18"/>
               </w:rPr>
-              <w:t>6,298</w:t>
+              <w:t>6,227</w:t>
             </w:r>
           </w:p>
         </w:tc>
@@ -2786,7 +2786,7 @@
               <w:rPr>
                 <w:sz w:val="18"/>
               </w:rPr>
-              <w:t>57.5 %</w:t>
+              <w:t>58.1 %</w:t>
             </w:r>
           </w:p>
         </w:tc>
@@ -2803,7 +2803,7 @@
               <w:rPr>
                 <w:sz w:val="18"/>
               </w:rPr>
-              <w:t>52.1 %</w:t>
+              <w:t>52.7 %</w:t>
             </w:r>
           </w:p>
         </w:tc>
@@ -2820,7 +2820,7 @@
               <w:rPr>
                 <w:sz w:val="18"/>
               </w:rPr>
-              <w:t>+24.7 %</w:t>
+              <w:t>+26.5 %</w:t>
             </w:r>
           </w:p>
         </w:tc>
@@ -2837,7 +2837,7 @@
               <w:rPr>
                 <w:sz w:val="18"/>
               </w:rPr>
-              <w:t>+6.6 %</w:t>
+              <w:t>+8.2 %</w:t>
             </w:r>
           </w:p>
         </w:tc>
@@ -2854,7 +2854,7 @@
               <w:rPr>
                 <w:sz w:val="18"/>
               </w:rPr>
-              <w:t>54.6 %</w:t>
+              <w:t>54.1 %</w:t>
             </w:r>
           </w:p>
         </w:tc>
@@ -2890,7 +2890,7 @@
               <w:rPr>
                 <w:sz w:val="18"/>
               </w:rPr>
-              <w:t>7,835</w:t>
+              <w:t>7,767</w:t>
             </w:r>
           </w:p>
         </w:tc>
@@ -2907,7 +2907,7 @@
               <w:rPr>
                 <w:sz w:val="18"/>
               </w:rPr>
-              <w:t>60.8 %</w:t>
+              <w:t>61.4 %</w:t>
             </w:r>
           </w:p>
         </w:tc>
@@ -2924,7 +2924,7 @@
               <w:rPr>
                 <w:sz w:val="18"/>
               </w:rPr>
-              <w:t>56.9 %</w:t>
+              <w:t>57.4 %</w:t>
             </w:r>
           </w:p>
         </w:tc>
@@ -2941,7 +2941,7 @@
               <w:rPr>
                 <w:sz w:val="18"/>
               </w:rPr>
-              <w:t>+37.5 %</w:t>
+              <w:t>+39.1 %</w:t>
             </w:r>
           </w:p>
         </w:tc>
@@ -2958,7 +2958,7 @@
               <w:rPr>
                 <w:sz w:val="18"/>
               </w:rPr>
-              <w:t>+21.1 %</w:t>
+              <w:t>+22.5 %</w:t>
             </w:r>
           </w:p>
         </w:tc>
@@ -2975,7 +2975,7 @@
               <w:rPr>
                 <w:sz w:val="18"/>
               </w:rPr>
-              <w:t>61.6 %</w:t>
+              <w:t>61.3 %</w:t>
             </w:r>
           </w:p>
         </w:tc>
@@ -3011,7 +3011,7 @@
               <w:rPr>
                 <w:sz w:val="18"/>
               </w:rPr>
-              <w:t>5,830</w:t>
+              <w:t>5,787</w:t>
             </w:r>
           </w:p>
         </w:tc>
@@ -3028,7 +3028,7 @@
               <w:rPr>
                 <w:sz w:val="18"/>
               </w:rPr>
-              <w:t>55.5 %</w:t>
+              <w:t>55.9 %</w:t>
             </w:r>
           </w:p>
         </w:tc>
@@ -3045,7 +3045,7 @@
               <w:rPr>
                 <w:sz w:val="18"/>
               </w:rPr>
-              <w:t>50.7 %</w:t>
+              <w:t>51.1 %</w:t>
             </w:r>
           </w:p>
         </w:tc>
@@ -3062,7 +3062,7 @@
               <w:rPr>
                 <w:sz w:val="18"/>
               </w:rPr>
-              <w:t>+12.0 %</w:t>
+              <w:t>+13.4 %</w:t>
             </w:r>
           </w:p>
         </w:tc>
@@ -3079,7 +3079,7 @@
               <w:rPr>
                 <w:sz w:val="18"/>
               </w:rPr>
-              <w:t>+0.8 %</w:t>
+              <w:t>+1.3 %</w:t>
             </w:r>
           </w:p>
         </w:tc>
@@ -3096,7 +3096,7 @@
               <w:rPr>
                 <w:sz w:val="18"/>
               </w:rPr>
-              <w:t>50.6 %</w:t>
+              <w:t>50.2 %</w:t>
             </w:r>
           </w:p>
         </w:tc>
@@ -3132,7 +3132,7 @@
               <w:rPr>
                 <w:sz w:val="18"/>
               </w:rPr>
-              <w:t>4,836</w:t>
+              <w:t>4,797</w:t>
             </w:r>
           </w:p>
         </w:tc>
@@ -3149,7 +3149,7 @@
               <w:rPr>
                 <w:sz w:val="18"/>
               </w:rPr>
-              <w:t>62.2 %</w:t>
+              <w:t>62.7 %</w:t>
             </w:r>
           </w:p>
         </w:tc>
@@ -3166,7 +3166,7 @@
               <w:rPr>
                 <w:sz w:val="18"/>
               </w:rPr>
-              <w:t>56.8 %</w:t>
+              <w:t>57.2 %</w:t>
             </w:r>
           </w:p>
         </w:tc>
@@ -3183,7 +3183,7 @@
               <w:rPr>
                 <w:sz w:val="18"/>
               </w:rPr>
-              <w:t>+38.7 %</w:t>
+              <w:t>+40.4 %</w:t>
             </w:r>
           </w:p>
         </w:tc>
@@ -3200,7 +3200,7 @@
               <w:rPr>
                 <w:sz w:val="18"/>
               </w:rPr>
-              <w:t>+17.6 %</w:t>
+              <w:t>+18.6 %</w:t>
             </w:r>
           </w:p>
         </w:tc>
@@ -3217,7 +3217,7 @@
               <w:rPr>
                 <w:sz w:val="18"/>
               </w:rPr>
-              <w:t>45.6 %</w:t>
+              <w:t>45.2 %</w:t>
             </w:r>
           </w:p>
         </w:tc>
@@ -3576,7 +3576,7 @@
               <w:rPr>
                 <w:sz w:val="18"/>
               </w:rPr>
-              <w:t>1,050</w:t>
+              <w:t>1,048</w:t>
             </w:r>
           </w:p>
         </w:tc>
@@ -3593,7 +3593,7 @@
               <w:rPr>
                 <w:sz w:val="18"/>
               </w:rPr>
-              <w:t>88.2 %</w:t>
+              <w:t>88.4 %</w:t>
             </w:r>
           </w:p>
         </w:tc>
@@ -3610,7 +3610,7 @@
               <w:rPr>
                 <w:sz w:val="18"/>
               </w:rPr>
-              <w:t>79.8 %</w:t>
+              <w:t>80.0 %</w:t>
             </w:r>
           </w:p>
         </w:tc>
@@ -3627,7 +3627,7 @@
               <w:rPr>
                 <w:sz w:val="18"/>
               </w:rPr>
-              <w:t>+451.4 %</w:t>
+              <w:t>+452.3 %</w:t>
             </w:r>
           </w:p>
         </w:tc>
@@ -3644,7 +3644,7 @@
               <w:rPr>
                 <w:sz w:val="18"/>
               </w:rPr>
-              <w:t>+160.4 %</w:t>
+              <w:t>+160.8 %</w:t>
             </w:r>
           </w:p>
         </w:tc>
@@ -3697,7 +3697,7 @@
               <w:rPr>
                 <w:sz w:val="18"/>
               </w:rPr>
-              <w:t>6,298</w:t>
+              <w:t>6,227</w:t>
             </w:r>
           </w:p>
         </w:tc>
@@ -3714,7 +3714,7 @@
               <w:rPr>
                 <w:sz w:val="18"/>
               </w:rPr>
-              <w:t>56.1 %</w:t>
+              <w:t>56.8 %</w:t>
             </w:r>
           </w:p>
         </w:tc>
@@ -3731,7 +3731,7 @@
               <w:rPr>
                 <w:sz w:val="18"/>
               </w:rPr>
-              <w:t>51.8 %</w:t>
+              <w:t>52.4 %</w:t>
             </w:r>
           </w:p>
         </w:tc>
@@ -3748,7 +3748,7 @@
               <w:rPr>
                 <w:sz w:val="18"/>
               </w:rPr>
-              <w:t>+25.0 %</w:t>
+              <w:t>+26.7 %</w:t>
             </w:r>
           </w:p>
         </w:tc>
@@ -3765,7 +3765,7 @@
               <w:rPr>
                 <w:sz w:val="18"/>
               </w:rPr>
-              <w:t>+5.8 %</w:t>
+              <w:t>+7.6 %</w:t>
             </w:r>
           </w:p>
         </w:tc>
@@ -3782,7 +3782,7 @@
               <w:rPr>
                 <w:sz w:val="18"/>
               </w:rPr>
-              <w:t>87.0 %</w:t>
+              <w:t>86.8 %</w:t>
             </w:r>
           </w:p>
         </w:tc>
@@ -4562,7 +4562,7 @@
               <w:rPr>
                 <w:sz w:val="18"/>
               </w:rPr>
-              <w:t>+23.7 %</w:t>
+              <w:t>+23.8 %</w:t>
             </w:r>
           </w:p>
         </w:tc>
@@ -4736,7 +4736,7 @@
               <w:rPr>
                 <w:sz w:val="18"/>
               </w:rPr>
-              <w:t>51.2 %</w:t>
+              <w:t>51.3 %</w:t>
             </w:r>
           </w:p>
         </w:tc>
@@ -4770,7 +4770,7 @@
               <w:rPr>
                 <w:sz w:val="18"/>
               </w:rPr>
-              <w:t>+3.2 %</w:t>
+              <w:t>+3.4 %</w:t>
             </w:r>
           </w:p>
         </w:tc>
@@ -4840,7 +4840,7 @@
               <w:rPr>
                 <w:sz w:val="18"/>
               </w:rPr>
-              <w:t>44.1 %</w:t>
+              <w:t>44.2 %</w:t>
             </w:r>
           </w:p>
         </w:tc>
@@ -4874,7 +4874,7 @@
               <w:rPr>
                 <w:sz w:val="18"/>
               </w:rPr>
-              <w:t>-18.0 %</w:t>
+              <w:t>-18.1 %</w:t>
             </w:r>
           </w:p>
         </w:tc>
@@ -4944,7 +4944,7 @@
               <w:rPr>
                 <w:sz w:val="18"/>
               </w:rPr>
-              <w:t>48.3 %</w:t>
+              <w:t>48.4 %</w:t>
             </w:r>
           </w:p>
         </w:tc>
@@ -4978,7 +4978,7 @@
               <w:rPr>
                 <w:sz w:val="18"/>
               </w:rPr>
-              <w:t>-6.0 %</w:t>
+              <w:t>-6.6 %</w:t>
             </w:r>
           </w:p>
         </w:tc>
@@ -5048,7 +5048,7 @@
               <w:rPr>
                 <w:sz w:val="18"/>
               </w:rPr>
-              <w:t>41.4 %</w:t>
+              <w:t>41.5 %</w:t>
             </w:r>
           </w:p>
         </w:tc>
@@ -5082,7 +5082,7 @@
               <w:rPr>
                 <w:sz w:val="18"/>
               </w:rPr>
-              <w:t>-28.4 %</w:t>
+              <w:t>-28.8 %</w:t>
             </w:r>
           </w:p>
         </w:tc>
@@ -5107,20 +5107,21 @@
         <w:tblLook w:firstColumn="1" w:firstRow="1" w:lastColumn="0" w:lastRow="0" w:noHBand="0" w:noVBand="1" w:val="04A0"/>
       </w:tblPr>
       <w:tblGrid>
-        <w:gridCol w:w="1120"/>
-        <w:gridCol w:w="1120"/>
-        <w:gridCol w:w="1120"/>
-        <w:gridCol w:w="1120"/>
-        <w:gridCol w:w="1120"/>
-        <w:gridCol w:w="1120"/>
-        <w:gridCol w:w="1120"/>
-        <w:gridCol w:w="1120"/>
-        <w:gridCol w:w="1120"/>
+        <w:gridCol w:w="1008"/>
+        <w:gridCol w:w="1008"/>
+        <w:gridCol w:w="1008"/>
+        <w:gridCol w:w="1008"/>
+        <w:gridCol w:w="1008"/>
+        <w:gridCol w:w="1008"/>
+        <w:gridCol w:w="1008"/>
+        <w:gridCol w:w="1008"/>
+        <w:gridCol w:w="1008"/>
+        <w:gridCol w:w="1008"/>
       </w:tblGrid>
       <w:tr>
         <w:tc>
           <w:tcPr>
-            <w:tcW w:type="dxa" w:w="1120"/>
+            <w:tcW w:type="dxa" w:w="1008"/>
             <w:shd w:val="clear" w:color="auto" w:fill="E2E8F0"/>
           </w:tcPr>
           <w:p>
@@ -5139,7 +5140,7 @@
         </w:tc>
         <w:tc>
           <w:tcPr>
-            <w:tcW w:type="dxa" w:w="1120"/>
+            <w:tcW w:type="dxa" w:w="1008"/>
             <w:shd w:val="clear" w:color="auto" w:fill="E2E8F0"/>
           </w:tcPr>
           <w:p>
@@ -5158,7 +5159,7 @@
         </w:tc>
         <w:tc>
           <w:tcPr>
-            <w:tcW w:type="dxa" w:w="1120"/>
+            <w:tcW w:type="dxa" w:w="1008"/>
             <w:shd w:val="clear" w:color="auto" w:fill="E2E8F0"/>
           </w:tcPr>
           <w:p>
@@ -5177,7 +5178,7 @@
         </w:tc>
         <w:tc>
           <w:tcPr>
-            <w:tcW w:type="dxa" w:w="1120"/>
+            <w:tcW w:type="dxa" w:w="1008"/>
             <w:shd w:val="clear" w:color="auto" w:fill="E2E8F0"/>
           </w:tcPr>
           <w:p>
@@ -5196,7 +5197,7 @@
         </w:tc>
         <w:tc>
           <w:tcPr>
-            <w:tcW w:type="dxa" w:w="1120"/>
+            <w:tcW w:type="dxa" w:w="1008"/>
             <w:shd w:val="clear" w:color="auto" w:fill="E2E8F0"/>
           </w:tcPr>
           <w:p>
@@ -5215,7 +5216,7 @@
         </w:tc>
         <w:tc>
           <w:tcPr>
-            <w:tcW w:type="dxa" w:w="1120"/>
+            <w:tcW w:type="dxa" w:w="1008"/>
             <w:shd w:val="clear" w:color="auto" w:fill="E2E8F0"/>
           </w:tcPr>
           <w:p>
@@ -5234,7 +5235,7 @@
         </w:tc>
         <w:tc>
           <w:tcPr>
-            <w:tcW w:type="dxa" w:w="1120"/>
+            <w:tcW w:type="dxa" w:w="1008"/>
             <w:shd w:val="clear" w:color="auto" w:fill="E2E8F0"/>
           </w:tcPr>
           <w:p>
@@ -5253,7 +5254,7 @@
         </w:tc>
         <w:tc>
           <w:tcPr>
-            <w:tcW w:type="dxa" w:w="1120"/>
+            <w:tcW w:type="dxa" w:w="1008"/>
             <w:shd w:val="clear" w:color="auto" w:fill="E2E8F0"/>
           </w:tcPr>
           <w:p>
@@ -5272,7 +5273,26 @@
         </w:tc>
         <w:tc>
           <w:tcPr>
-            <w:tcW w:type="dxa" w:w="1120"/>
+            <w:tcW w:type="dxa" w:w="1008"/>
+            <w:shd w:val="clear" w:color="auto" w:fill="E2E8F0"/>
+          </w:tcPr>
+          <w:p>
+            <w:pPr>
+              <w:jc w:val="center"/>
+            </w:pPr>
+            <w:r/>
+            <w:r>
+              <w:rPr>
+                <w:b/>
+                <w:sz w:val="18"/>
+              </w:rPr>
+              <w:t>No post-start obs</w:t>
+            </w:r>
+          </w:p>
+        </w:tc>
+        <w:tc>
+          <w:tcPr>
+            <w:tcW w:type="dxa" w:w="1008"/>
             <w:shd w:val="clear" w:color="auto" w:fill="E2E8F0"/>
           </w:tcPr>
           <w:p>
@@ -5293,7 +5313,7 @@
       <w:tr>
         <w:tc>
           <w:tcPr>
-            <w:tcW w:type="dxa" w:w="1120"/>
+            <w:tcW w:type="dxa" w:w="1008"/>
           </w:tcPr>
           <w:p>
             <w:pPr>
@@ -5310,7 +5330,7 @@
         </w:tc>
         <w:tc>
           <w:tcPr>
-            <w:tcW w:type="dxa" w:w="1120"/>
+            <w:tcW w:type="dxa" w:w="1008"/>
           </w:tcPr>
           <w:p>
             <w:pPr>
@@ -5327,7 +5347,7 @@
         </w:tc>
         <w:tc>
           <w:tcPr>
-            <w:tcW w:type="dxa" w:w="1120"/>
+            <w:tcW w:type="dxa" w:w="1008"/>
           </w:tcPr>
           <w:p>
             <w:pPr>
@@ -5344,7 +5364,7 @@
         </w:tc>
         <w:tc>
           <w:tcPr>
-            <w:tcW w:type="dxa" w:w="1120"/>
+            <w:tcW w:type="dxa" w:w="1008"/>
           </w:tcPr>
           <w:p>
             <w:pPr>
@@ -5361,7 +5381,7 @@
         </w:tc>
         <w:tc>
           <w:tcPr>
-            <w:tcW w:type="dxa" w:w="1120"/>
+            <w:tcW w:type="dxa" w:w="1008"/>
           </w:tcPr>
           <w:p>
             <w:pPr>
@@ -5378,7 +5398,7 @@
         </w:tc>
         <w:tc>
           <w:tcPr>
-            <w:tcW w:type="dxa" w:w="1120"/>
+            <w:tcW w:type="dxa" w:w="1008"/>
           </w:tcPr>
           <w:p>
             <w:pPr>
@@ -5395,7 +5415,7 @@
         </w:tc>
         <w:tc>
           <w:tcPr>
-            <w:tcW w:type="dxa" w:w="1120"/>
+            <w:tcW w:type="dxa" w:w="1008"/>
           </w:tcPr>
           <w:p>
             <w:pPr>
@@ -5412,7 +5432,7 @@
         </w:tc>
         <w:tc>
           <w:tcPr>
-            <w:tcW w:type="dxa" w:w="1120"/>
+            <w:tcW w:type="dxa" w:w="1008"/>
           </w:tcPr>
           <w:p>
             <w:pPr>
@@ -5429,7 +5449,24 @@
         </w:tc>
         <w:tc>
           <w:tcPr>
-            <w:tcW w:type="dxa" w:w="1120"/>
+            <w:tcW w:type="dxa" w:w="1008"/>
+          </w:tcPr>
+          <w:p>
+            <w:pPr>
+              <w:jc w:val="right"/>
+            </w:pPr>
+            <w:r/>
+            <w:r>
+              <w:rPr>
+                <w:sz w:val="18"/>
+              </w:rPr>
+              <w:t>0</w:t>
+            </w:r>
+          </w:p>
+        </w:tc>
+        <w:tc>
+          <w:tcPr>
+            <w:tcW w:type="dxa" w:w="1008"/>
           </w:tcPr>
           <w:p>
             <w:pPr>
@@ -5448,7 +5485,7 @@
       <w:tr>
         <w:tc>
           <w:tcPr>
-            <w:tcW w:type="dxa" w:w="1120"/>
+            <w:tcW w:type="dxa" w:w="1008"/>
           </w:tcPr>
           <w:p>
             <w:pPr>
@@ -5465,7 +5502,7 @@
         </w:tc>
         <w:tc>
           <w:tcPr>
-            <w:tcW w:type="dxa" w:w="1120"/>
+            <w:tcW w:type="dxa" w:w="1008"/>
           </w:tcPr>
           <w:p>
             <w:pPr>
@@ -5482,7 +5519,7 @@
         </w:tc>
         <w:tc>
           <w:tcPr>
-            <w:tcW w:type="dxa" w:w="1120"/>
+            <w:tcW w:type="dxa" w:w="1008"/>
           </w:tcPr>
           <w:p>
             <w:pPr>
@@ -5499,7 +5536,7 @@
         </w:tc>
         <w:tc>
           <w:tcPr>
-            <w:tcW w:type="dxa" w:w="1120"/>
+            <w:tcW w:type="dxa" w:w="1008"/>
           </w:tcPr>
           <w:p>
             <w:pPr>
@@ -5516,7 +5553,7 @@
         </w:tc>
         <w:tc>
           <w:tcPr>
-            <w:tcW w:type="dxa" w:w="1120"/>
+            <w:tcW w:type="dxa" w:w="1008"/>
           </w:tcPr>
           <w:p>
             <w:pPr>
@@ -5533,7 +5570,7 @@
         </w:tc>
         <w:tc>
           <w:tcPr>
-            <w:tcW w:type="dxa" w:w="1120"/>
+            <w:tcW w:type="dxa" w:w="1008"/>
           </w:tcPr>
           <w:p>
             <w:pPr>
@@ -5550,7 +5587,7 @@
         </w:tc>
         <w:tc>
           <w:tcPr>
-            <w:tcW w:type="dxa" w:w="1120"/>
+            <w:tcW w:type="dxa" w:w="1008"/>
           </w:tcPr>
           <w:p>
             <w:pPr>
@@ -5567,7 +5604,7 @@
         </w:tc>
         <w:tc>
           <w:tcPr>
-            <w:tcW w:type="dxa" w:w="1120"/>
+            <w:tcW w:type="dxa" w:w="1008"/>
           </w:tcPr>
           <w:p>
             <w:pPr>
@@ -5584,7 +5621,24 @@
         </w:tc>
         <w:tc>
           <w:tcPr>
-            <w:tcW w:type="dxa" w:w="1120"/>
+            <w:tcW w:type="dxa" w:w="1008"/>
+          </w:tcPr>
+          <w:p>
+            <w:pPr>
+              <w:jc w:val="right"/>
+            </w:pPr>
+            <w:r/>
+            <w:r>
+              <w:rPr>
+                <w:sz w:val="18"/>
+              </w:rPr>
+              <w:t>0</w:t>
+            </w:r>
+          </w:p>
+        </w:tc>
+        <w:tc>
+          <w:tcPr>
+            <w:tcW w:type="dxa" w:w="1008"/>
           </w:tcPr>
           <w:p>
             <w:pPr>
@@ -5603,7 +5657,7 @@
       <w:tr>
         <w:tc>
           <w:tcPr>
-            <w:tcW w:type="dxa" w:w="1120"/>
+            <w:tcW w:type="dxa" w:w="1008"/>
           </w:tcPr>
           <w:p>
             <w:pPr>
@@ -5620,7 +5674,7 @@
         </w:tc>
         <w:tc>
           <w:tcPr>
-            <w:tcW w:type="dxa" w:w="1120"/>
+            <w:tcW w:type="dxa" w:w="1008"/>
           </w:tcPr>
           <w:p>
             <w:pPr>
@@ -5637,7 +5691,7 @@
         </w:tc>
         <w:tc>
           <w:tcPr>
-            <w:tcW w:type="dxa" w:w="1120"/>
+            <w:tcW w:type="dxa" w:w="1008"/>
           </w:tcPr>
           <w:p>
             <w:pPr>
@@ -5654,7 +5708,7 @@
         </w:tc>
         <w:tc>
           <w:tcPr>
-            <w:tcW w:type="dxa" w:w="1120"/>
+            <w:tcW w:type="dxa" w:w="1008"/>
           </w:tcPr>
           <w:p>
             <w:pPr>
@@ -5671,7 +5725,7 @@
         </w:tc>
         <w:tc>
           <w:tcPr>
-            <w:tcW w:type="dxa" w:w="1120"/>
+            <w:tcW w:type="dxa" w:w="1008"/>
           </w:tcPr>
           <w:p>
             <w:pPr>
@@ -5682,13 +5736,13 @@
               <w:rPr>
                 <w:sz w:val="18"/>
               </w:rPr>
-              <w:t>35,167</w:t>
+              <w:t>34,912</w:t>
             </w:r>
           </w:p>
         </w:tc>
         <w:tc>
           <w:tcPr>
-            <w:tcW w:type="dxa" w:w="1120"/>
+            <w:tcW w:type="dxa" w:w="1008"/>
           </w:tcPr>
           <w:p>
             <w:pPr>
@@ -5705,7 +5759,7 @@
         </w:tc>
         <w:tc>
           <w:tcPr>
-            <w:tcW w:type="dxa" w:w="1120"/>
+            <w:tcW w:type="dxa" w:w="1008"/>
           </w:tcPr>
           <w:p>
             <w:pPr>
@@ -5722,7 +5776,7 @@
         </w:tc>
         <w:tc>
           <w:tcPr>
-            <w:tcW w:type="dxa" w:w="1120"/>
+            <w:tcW w:type="dxa" w:w="1008"/>
           </w:tcPr>
           <w:p>
             <w:pPr>
@@ -5739,7 +5793,24 @@
         </w:tc>
         <w:tc>
           <w:tcPr>
-            <w:tcW w:type="dxa" w:w="1120"/>
+            <w:tcW w:type="dxa" w:w="1008"/>
+          </w:tcPr>
+          <w:p>
+            <w:pPr>
+              <w:jc w:val="right"/>
+            </w:pPr>
+            <w:r/>
+            <w:r>
+              <w:rPr>
+                <w:sz w:val="18"/>
+              </w:rPr>
+              <w:t>255</w:t>
+            </w:r>
+          </w:p>
+        </w:tc>
+        <w:tc>
+          <w:tcPr>
+            <w:tcW w:type="dxa" w:w="1008"/>
           </w:tcPr>
           <w:p>
             <w:pPr>
@@ -5758,7 +5829,7 @@
       <w:tr>
         <w:tc>
           <w:tcPr>
-            <w:tcW w:type="dxa" w:w="1120"/>
+            <w:tcW w:type="dxa" w:w="1008"/>
           </w:tcPr>
           <w:p>
             <w:pPr>
@@ -5775,7 +5846,7 @@
         </w:tc>
         <w:tc>
           <w:tcPr>
-            <w:tcW w:type="dxa" w:w="1120"/>
+            <w:tcW w:type="dxa" w:w="1008"/>
           </w:tcPr>
           <w:p>
             <w:pPr>
@@ -5792,7 +5863,7 @@
         </w:tc>
         <w:tc>
           <w:tcPr>
-            <w:tcW w:type="dxa" w:w="1120"/>
+            <w:tcW w:type="dxa" w:w="1008"/>
           </w:tcPr>
           <w:p>
             <w:pPr>
@@ -5809,7 +5880,7 @@
         </w:tc>
         <w:tc>
           <w:tcPr>
-            <w:tcW w:type="dxa" w:w="1120"/>
+            <w:tcW w:type="dxa" w:w="1008"/>
           </w:tcPr>
           <w:p>
             <w:pPr>
@@ -5826,7 +5897,7 @@
         </w:tc>
         <w:tc>
           <w:tcPr>
-            <w:tcW w:type="dxa" w:w="1120"/>
+            <w:tcW w:type="dxa" w:w="1008"/>
           </w:tcPr>
           <w:p>
             <w:pPr>
@@ -5837,13 +5908,13 @@
               <w:rPr>
                 <w:sz w:val="18"/>
               </w:rPr>
-              <w:t>7,856</w:t>
+              <w:t>7,783</w:t>
             </w:r>
           </w:p>
         </w:tc>
         <w:tc>
           <w:tcPr>
-            <w:tcW w:type="dxa" w:w="1120"/>
+            <w:tcW w:type="dxa" w:w="1008"/>
           </w:tcPr>
           <w:p>
             <w:pPr>
@@ -5860,7 +5931,7 @@
         </w:tc>
         <w:tc>
           <w:tcPr>
-            <w:tcW w:type="dxa" w:w="1120"/>
+            <w:tcW w:type="dxa" w:w="1008"/>
           </w:tcPr>
           <w:p>
             <w:pPr>
@@ -5877,7 +5948,7 @@
         </w:tc>
         <w:tc>
           <w:tcPr>
-            <w:tcW w:type="dxa" w:w="1120"/>
+            <w:tcW w:type="dxa" w:w="1008"/>
           </w:tcPr>
           <w:p>
             <w:pPr>
@@ -5894,7 +5965,24 @@
         </w:tc>
         <w:tc>
           <w:tcPr>
-            <w:tcW w:type="dxa" w:w="1120"/>
+            <w:tcW w:type="dxa" w:w="1008"/>
+          </w:tcPr>
+          <w:p>
+            <w:pPr>
+              <w:jc w:val="right"/>
+            </w:pPr>
+            <w:r/>
+            <w:r>
+              <w:rPr>
+                <w:sz w:val="18"/>
+              </w:rPr>
+              <w:t>73</w:t>
+            </w:r>
+          </w:p>
+        </w:tc>
+        <w:tc>
+          <w:tcPr>
+            <w:tcW w:type="dxa" w:w="1008"/>
           </w:tcPr>
           <w:p>
             <w:pPr>

</xml_diff>